<commit_message>
Updating script and new yml
</commit_message>
<xml_diff>
--- a/Documentation/Excel Automation Report.docx
+++ b/Documentation/Excel Automation Report.docx
@@ -3594,6 +3594,9 @@
         <w:ind w:left="720"/>
       </w:pPr>
       <w:r>
+        <w:rPr>
+          <w:noProof/>
+        </w:rPr>
         <w:drawing>
           <wp:inline distT="0" distB="0" distL="0" distR="0" wp14:anchorId="5297086B" wp14:editId="39E81847">
             <wp:extent cx="5943600" cy="2950210"/>
@@ -3650,6 +3653,9 @@
         <w:ind w:left="720"/>
       </w:pPr>
       <w:r>
+        <w:rPr>
+          <w:noProof/>
+        </w:rPr>
         <w:drawing>
           <wp:inline distT="0" distB="0" distL="0" distR="0" wp14:anchorId="5253B985" wp14:editId="5E2B6C07">
             <wp:extent cx="5943600" cy="2541270"/>
@@ -3893,11 +3899,305 @@
       <w:pPr>
         <w:pStyle w:val="NoSpacing"/>
         <w:ind w:left="720"/>
+      </w:pPr>
+      <w:r>
+        <w:t xml:space="preserve">Using </w:t>
+      </w:r>
+      <w:proofErr w:type="spellStart"/>
+      <w:proofErr w:type="gramStart"/>
+      <w:r>
+        <w:t>github</w:t>
+      </w:r>
+      <w:proofErr w:type="spellEnd"/>
+      <w:proofErr w:type="gramEnd"/>
+      <w:r>
+        <w:t xml:space="preserve"> actions I would be scheduling three scripts. One for data entry, two for customer segment emailing</w:t>
+      </w:r>
+    </w:p>
+    <w:p>
+      <w:pPr>
+        <w:pStyle w:val="NoSpacing"/>
+        <w:ind w:left="720"/>
+      </w:pPr>
+    </w:p>
+    <w:p>
+      <w:pPr>
+        <w:pStyle w:val="NoSpacing"/>
+        <w:ind w:left="720"/>
         <w:rPr>
           <w:b/>
           <w:bCs/>
         </w:rPr>
       </w:pPr>
+      <w:r>
+        <w:rPr>
+          <w:b/>
+          <w:bCs/>
+        </w:rPr>
+        <w:t>Data Entry</w:t>
+      </w:r>
+    </w:p>
+    <w:p>
+      <w:pPr>
+        <w:pStyle w:val="NoSpacing"/>
+        <w:ind w:left="720"/>
+      </w:pPr>
+      <w:r>
+        <w:t xml:space="preserve">The script scheduled to enter data daily was hosted successfully after some errors I encountered with python and </w:t>
+      </w:r>
+      <w:proofErr w:type="spellStart"/>
+      <w:r>
+        <w:t>github</w:t>
+      </w:r>
+      <w:proofErr w:type="spellEnd"/>
+      <w:r>
+        <w:t xml:space="preserve"> not being able to read name</w:t>
+      </w:r>
+      <w:r>
+        <w:t xml:space="preserve"> with spaces, I did a lot of renaming on folder names and pushed </w:t>
+      </w:r>
+      <w:proofErr w:type="gramStart"/>
+      <w:r>
+        <w:t>al</w:t>
+      </w:r>
+      <w:proofErr w:type="gramEnd"/>
+      <w:r>
+        <w:t xml:space="preserve"> changes to </w:t>
+      </w:r>
+      <w:proofErr w:type="spellStart"/>
+      <w:r>
+        <w:t>github</w:t>
+      </w:r>
+      <w:proofErr w:type="spellEnd"/>
+    </w:p>
+    <w:p>
+      <w:pPr>
+        <w:pStyle w:val="NoSpacing"/>
+        <w:ind w:left="720"/>
+      </w:pPr>
+    </w:p>
+    <w:p>
+      <w:pPr>
+        <w:pStyle w:val="NoSpacing"/>
+        <w:ind w:left="720"/>
+      </w:pPr>
+      <w:r>
+        <w:rPr>
+          <w:noProof/>
+        </w:rPr>
+        <w:lastRenderedPageBreak/>
+        <w:drawing>
+          <wp:inline distT="0" distB="0" distL="0" distR="0" wp14:anchorId="51250C5B" wp14:editId="4C669F68">
+            <wp:extent cx="5943600" cy="2531745"/>
+            <wp:effectExtent l="0" t="0" r="0" b="1905"/>
+            <wp:docPr id="1519461871" name="Picture 1"/>
+            <wp:cNvGraphicFramePr>
+              <a:graphicFrameLocks xmlns:a="http://schemas.openxmlformats.org/drawingml/2006/main" noChangeAspect="1"/>
+            </wp:cNvGraphicFramePr>
+            <a:graphic xmlns:a="http://schemas.openxmlformats.org/drawingml/2006/main">
+              <a:graphicData uri="http://schemas.openxmlformats.org/drawingml/2006/picture">
+                <pic:pic xmlns:pic="http://schemas.openxmlformats.org/drawingml/2006/picture">
+                  <pic:nvPicPr>
+                    <pic:cNvPr id="1519461871" name=""/>
+                    <pic:cNvPicPr/>
+                  </pic:nvPicPr>
+                  <pic:blipFill>
+                    <a:blip r:embed="rId26"/>
+                    <a:stretch>
+                      <a:fillRect/>
+                    </a:stretch>
+                  </pic:blipFill>
+                  <pic:spPr>
+                    <a:xfrm>
+                      <a:off x="0" y="0"/>
+                      <a:ext cx="5943600" cy="2531745"/>
+                    </a:xfrm>
+                    <a:prstGeom prst="rect">
+                      <a:avLst/>
+                    </a:prstGeom>
+                  </pic:spPr>
+                </pic:pic>
+              </a:graphicData>
+            </a:graphic>
+          </wp:inline>
+        </w:drawing>
+      </w:r>
+    </w:p>
+    <w:p>
+      <w:pPr>
+        <w:pStyle w:val="NoSpacing"/>
+        <w:ind w:left="720"/>
+      </w:pPr>
+      <w:r>
+        <w:t>By tomorrow I will check back to see if the schedule continues daily.</w:t>
+      </w:r>
+    </w:p>
+    <w:p>
+      <w:pPr>
+        <w:pStyle w:val="NoSpacing"/>
+        <w:ind w:left="720"/>
+      </w:pPr>
+    </w:p>
+    <w:p>
+      <w:pPr>
+        <w:pStyle w:val="NoSpacing"/>
+        <w:ind w:left="720"/>
+      </w:pPr>
+      <w:r>
+        <w:t>Today 7</w:t>
+      </w:r>
+      <w:r>
+        <w:rPr>
+          <w:vertAlign w:val="superscript"/>
+        </w:rPr>
+        <w:t>th</w:t>
+      </w:r>
+      <w:r>
+        <w:t xml:space="preserve"> march the automation continued to send in fresh data</w:t>
+      </w:r>
+    </w:p>
+    <w:p>
+      <w:pPr>
+        <w:pStyle w:val="NoSpacing"/>
+        <w:ind w:left="720"/>
+      </w:pPr>
+    </w:p>
+    <w:p>
+      <w:pPr>
+        <w:pStyle w:val="NoSpacing"/>
+        <w:ind w:left="720"/>
+        <w:rPr>
+          <w:b/>
+          <w:bCs/>
+        </w:rPr>
+      </w:pPr>
+      <w:r>
+        <w:rPr>
+          <w:b/>
+          <w:bCs/>
+        </w:rPr>
+        <w:t xml:space="preserve">Declining </w:t>
+      </w:r>
+      <w:proofErr w:type="gramStart"/>
+      <w:r>
+        <w:rPr>
+          <w:b/>
+          <w:bCs/>
+        </w:rPr>
+        <w:t>Revenue</w:t>
+      </w:r>
+      <w:proofErr w:type="gramEnd"/>
+      <w:r>
+        <w:rPr>
+          <w:b/>
+          <w:bCs/>
+        </w:rPr>
+        <w:t xml:space="preserve"> Customers</w:t>
+      </w:r>
+    </w:p>
+    <w:p>
+      <w:pPr>
+        <w:pStyle w:val="NoSpacing"/>
+        <w:ind w:left="720"/>
+      </w:pPr>
+      <w:r>
+        <w:t xml:space="preserve">The first batch of emails went </w:t>
+      </w:r>
+      <w:proofErr w:type="gramStart"/>
+      <w:r>
+        <w:t>through from</w:t>
+      </w:r>
+      <w:proofErr w:type="gramEnd"/>
+      <w:r>
+        <w:t xml:space="preserve"> </w:t>
+      </w:r>
+      <w:proofErr w:type="spellStart"/>
+      <w:r>
+        <w:t>github</w:t>
+      </w:r>
+      <w:proofErr w:type="spellEnd"/>
+      <w:r>
+        <w:t xml:space="preserve"> actions, By Sunday 8</w:t>
+      </w:r>
+      <w:r>
+        <w:rPr>
+          <w:vertAlign w:val="superscript"/>
+        </w:rPr>
+        <w:t>th</w:t>
+      </w:r>
+      <w:r>
+        <w:t xml:space="preserve"> march I would go back to see if the automation continues.</w:t>
+      </w:r>
+    </w:p>
+    <w:p>
+      <w:pPr>
+        <w:pStyle w:val="NoSpacing"/>
+        <w:ind w:left="720"/>
+      </w:pPr>
+    </w:p>
+    <w:p>
+      <w:pPr>
+        <w:pStyle w:val="NoSpacing"/>
+        <w:ind w:left="720"/>
+      </w:pPr>
+      <w:r>
+        <w:t xml:space="preserve">The script is scheduled to be triggered every </w:t>
+      </w:r>
+      <w:proofErr w:type="spellStart"/>
+      <w:r>
+        <w:t>sunday</w:t>
+      </w:r>
+      <w:proofErr w:type="spellEnd"/>
+    </w:p>
+    <w:p>
+      <w:pPr>
+        <w:pStyle w:val="NoSpacing"/>
+        <w:ind w:left="720"/>
+        <w:rPr>
+          <w:b/>
+          <w:bCs/>
+        </w:rPr>
+      </w:pPr>
+      <w:r>
+        <w:rPr>
+          <w:noProof/>
+        </w:rPr>
+        <w:drawing>
+          <wp:inline distT="0" distB="0" distL="0" distR="0" wp14:anchorId="2A73E488" wp14:editId="3EEA8D79">
+            <wp:extent cx="5943600" cy="1712595"/>
+            <wp:effectExtent l="0" t="0" r="0" b="1905"/>
+            <wp:docPr id="654252829" name="Picture 1"/>
+            <wp:cNvGraphicFramePr>
+              <a:graphicFrameLocks xmlns:a="http://schemas.openxmlformats.org/drawingml/2006/main" noChangeAspect="1"/>
+            </wp:cNvGraphicFramePr>
+            <a:graphic xmlns:a="http://schemas.openxmlformats.org/drawingml/2006/main">
+              <a:graphicData uri="http://schemas.openxmlformats.org/drawingml/2006/picture">
+                <pic:pic xmlns:pic="http://schemas.openxmlformats.org/drawingml/2006/picture">
+                  <pic:nvPicPr>
+                    <pic:cNvPr id="654252829" name=""/>
+                    <pic:cNvPicPr/>
+                  </pic:nvPicPr>
+                  <pic:blipFill>
+                    <a:blip r:embed="rId27"/>
+                    <a:stretch>
+                      <a:fillRect/>
+                    </a:stretch>
+                  </pic:blipFill>
+                  <pic:spPr>
+                    <a:xfrm>
+                      <a:off x="0" y="0"/>
+                      <a:ext cx="5943600" cy="1712595"/>
+                    </a:xfrm>
+                    <a:prstGeom prst="rect">
+                      <a:avLst/>
+                    </a:prstGeom>
+                  </pic:spPr>
+                </pic:pic>
+              </a:graphicData>
+            </a:graphic>
+          </wp:inline>
+        </w:drawing>
+      </w:r>
     </w:p>
     <w:sectPr>
       <w:pgSz w:w="12240" w:h="15840"/>
@@ -4724,6 +5024,7 @@
   <w:style w:type="character" w:default="1" w:styleId="DefaultParagraphFont">
     <w:name w:val="Default Paragraph Font"/>
     <w:uiPriority w:val="1"/>
+    <w:semiHidden/>
     <w:unhideWhenUsed/>
   </w:style>
   <w:style w:type="table" w:default="1" w:styleId="TableNormal">

</xml_diff>